<commit_message>
Remove middle stat block; merge Carrier into FactX on CV
</commit_message>
<xml_diff>
--- a/CV_Konstantinos_Vasilopoulos.docx
+++ b/CV_Konstantinos_Vasilopoulos.docx
@@ -336,7 +336,61 @@
           <w:sz w:val="20"/>
           <w:u w:val="none"/>
         </w:rPr>
-        <w:t>Delivered applied research, statistical analysis, and data visualisation projects on client site (Carrier B.V.).</w:t>
+        <w:t>Deployed as Data Consultant to Carrier BENELUX — delivered applied research, statistical analysis, and data visualisation projects on-site.</w:t>
+      </w:r>
+    </w:p>
+    <w:p>
+      <w:pPr>
+        <w:pStyle w:val="ListBullet"/>
+        <w:spacing w:before="0" w:after="20"/>
+        <w:ind w:left="360" w:hanging="259"/>
+      </w:pPr>
+      <w:r>
+        <w:rPr>
+          <w:rFonts w:ascii="Calibri" w:hAnsi="Calibri"/>
+          <w:b w:val="0"/>
+          <w:i w:val="0"/>
+          <w:color w:val="000000"/>
+          <w:sz w:val="20"/>
+          <w:u w:val="none"/>
+        </w:rPr>
+        <w:t>Analysed revenues and expenses to support quarterly forecasting and strategic planning for the BENELUX finance team.</w:t>
+      </w:r>
+    </w:p>
+    <w:p>
+      <w:pPr>
+        <w:pStyle w:val="ListBullet"/>
+        <w:spacing w:before="0" w:after="20"/>
+        <w:ind w:left="360" w:hanging="259"/>
+      </w:pPr>
+      <w:r>
+        <w:rPr>
+          <w:rFonts w:ascii="Calibri" w:hAnsi="Calibri"/>
+          <w:b w:val="0"/>
+          <w:i w:val="0"/>
+          <w:color w:val="000000"/>
+          <w:sz w:val="20"/>
+          <w:u w:val="none"/>
+        </w:rPr>
+        <w:t>Contributed to Oracle HFM to SAP migration by performing data mapping, validation, and reconciliation across global entities.</w:t>
+      </w:r>
+    </w:p>
+    <w:p>
+      <w:pPr>
+        <w:pStyle w:val="ListBullet"/>
+        <w:spacing w:before="0" w:after="20"/>
+        <w:ind w:left="360" w:hanging="259"/>
+      </w:pPr>
+      <w:r>
+        <w:rPr>
+          <w:rFonts w:ascii="Calibri" w:hAnsi="Calibri"/>
+          <w:b w:val="0"/>
+          <w:i w:val="0"/>
+          <w:color w:val="000000"/>
+          <w:sz w:val="20"/>
+          <w:u w:val="none"/>
+        </w:rPr>
+        <w:t>Prepared weekly flash financial reports (balance sheet) for multiple global entities; identified and corrected data errors and missing values.</w:t>
       </w:r>
     </w:p>
     <w:p>
@@ -355,6 +409,24 @@
           <w:u w:val="none"/>
         </w:rPr>
         <w:t>Built interactive Power BI and Tableau dashboards translating complex datasets into executive-ready business insights.</w:t>
+      </w:r>
+    </w:p>
+    <w:p>
+      <w:pPr>
+        <w:pStyle w:val="ListBullet"/>
+        <w:spacing w:before="0" w:after="20"/>
+        <w:ind w:left="360" w:hanging="259"/>
+      </w:pPr>
+      <w:r>
+        <w:rPr>
+          <w:rFonts w:ascii="Calibri" w:hAnsi="Calibri"/>
+          <w:b w:val="0"/>
+          <w:i w:val="0"/>
+          <w:color w:val="000000"/>
+          <w:sz w:val="20"/>
+          <w:u w:val="none"/>
+        </w:rPr>
+        <w:t>Collaborated directly with the CFO (George Schoorl, Carrier BENELUX) to prepare annual budgeting forecasts.</w:t>
       </w:r>
     </w:p>
     <w:p>
@@ -479,148 +551,6 @@
           <w:u w:val="none"/>
         </w:rPr>
         <w:t>Automated inventory tracking and reporting using Microsoft Excel (conditional formatting, formulas, macros).</w:t>
-      </w:r>
-    </w:p>
-    <w:p>
-      <w:pPr>
-        <w:spacing w:before="120" w:after="20"/>
-        <w:tabs>
-          <w:tab w:val="right" w:pos="9792"/>
-        </w:tabs>
-      </w:pPr>
-      <w:r>
-        <w:rPr>
-          <w:rFonts w:ascii="Calibri" w:hAnsi="Calibri"/>
-          <w:b/>
-          <w:i w:val="0"/>
-          <w:color w:val="000000"/>
-          <w:sz w:val="21"/>
-          <w:u w:val="none"/>
-        </w:rPr>
-        <w:t>FP&amp;A Analyst</w:t>
-      </w:r>
-      <w:r>
-        <w:rPr>
-          <w:rFonts w:ascii="Calibri" w:hAnsi="Calibri"/>
-          <w:b w:val="0"/>
-          <w:i w:val="0"/>
-          <w:color w:val="444444"/>
-          <w:sz w:val="20"/>
-          <w:u w:val="none"/>
-        </w:rPr>
-        <w:t xml:space="preserve">  |  Carrier BENELUX, Utrecht, Netherlands</w:t>
-      </w:r>
-      <w:r>
-        <w:rPr>
-          <w:rFonts w:ascii="Calibri" w:hAnsi="Calibri"/>
-          <w:b w:val="0"/>
-          <w:i w:val="0"/>
-          <w:color w:val="000000"/>
-          <w:sz w:val="20"/>
-          <w:u w:val="none"/>
-        </w:rPr>
-        <w:tab/>
-      </w:r>
-      <w:r>
-        <w:rPr>
-          <w:rFonts w:ascii="Calibri" w:hAnsi="Calibri"/>
-          <w:b w:val="0"/>
-          <w:i/>
-          <w:color w:val="444444"/>
-          <w:sz w:val="19"/>
-          <w:u w:val="none"/>
-        </w:rPr>
-        <w:t>September 2023 – January 2024</w:t>
-      </w:r>
-    </w:p>
-    <w:p>
-      <w:pPr>
-        <w:pStyle w:val="ListBullet"/>
-        <w:spacing w:before="0" w:after="20"/>
-        <w:ind w:left="360" w:hanging="259"/>
-      </w:pPr>
-      <w:r>
-        <w:rPr>
-          <w:rFonts w:ascii="Calibri" w:hAnsi="Calibri"/>
-          <w:b w:val="0"/>
-          <w:i w:val="0"/>
-          <w:color w:val="000000"/>
-          <w:sz w:val="20"/>
-          <w:u w:val="none"/>
-        </w:rPr>
-        <w:t>Analysed revenues and expenses to support quarterly forecasting and strategic planning for the BENELUX finance team.</w:t>
-      </w:r>
-    </w:p>
-    <w:p>
-      <w:pPr>
-        <w:pStyle w:val="ListBullet"/>
-        <w:spacing w:before="0" w:after="20"/>
-        <w:ind w:left="360" w:hanging="259"/>
-      </w:pPr>
-      <w:r>
-        <w:rPr>
-          <w:rFonts w:ascii="Calibri" w:hAnsi="Calibri"/>
-          <w:b w:val="0"/>
-          <w:i w:val="0"/>
-          <w:color w:val="000000"/>
-          <w:sz w:val="20"/>
-          <w:u w:val="none"/>
-        </w:rPr>
-        <w:t>Contributed to Oracle HFM to SAP migration by performing data mapping, validation, and reconciliation across global entities.</w:t>
-      </w:r>
-    </w:p>
-    <w:p>
-      <w:pPr>
-        <w:pStyle w:val="ListBullet"/>
-        <w:spacing w:before="0" w:after="20"/>
-        <w:ind w:left="360" w:hanging="259"/>
-      </w:pPr>
-      <w:r>
-        <w:rPr>
-          <w:rFonts w:ascii="Calibri" w:hAnsi="Calibri"/>
-          <w:b w:val="0"/>
-          <w:i w:val="0"/>
-          <w:color w:val="000000"/>
-          <w:sz w:val="20"/>
-          <w:u w:val="none"/>
-        </w:rPr>
-        <w:t>Prepared weekly flash financial reports (balance sheet) for multiple global entities; identified and corrected data errors and missing values.</w:t>
-      </w:r>
-    </w:p>
-    <w:p>
-      <w:pPr>
-        <w:pStyle w:val="ListBullet"/>
-        <w:spacing w:before="0" w:after="20"/>
-        <w:ind w:left="360" w:hanging="259"/>
-      </w:pPr>
-      <w:r>
-        <w:rPr>
-          <w:rFonts w:ascii="Calibri" w:hAnsi="Calibri"/>
-          <w:b w:val="0"/>
-          <w:i w:val="0"/>
-          <w:color w:val="000000"/>
-          <w:sz w:val="20"/>
-          <w:u w:val="none"/>
-        </w:rPr>
-        <w:t>Streamlined reporting workflows using advanced Excel functions and SAP tools, improving data accessibility for the wider finance team.</w:t>
-      </w:r>
-    </w:p>
-    <w:p>
-      <w:pPr>
-        <w:pStyle w:val="ListBullet"/>
-        <w:spacing w:before="0" w:after="20"/>
-        <w:ind w:left="360" w:hanging="259"/>
-      </w:pPr>
-      <w:r>
-        <w:rPr>
-          <w:rFonts w:ascii="Calibri" w:hAnsi="Calibri"/>
-          <w:b w:val="0"/>
-          <w:i w:val="0"/>
-          <w:color w:val="000000"/>
-          <w:sz w:val="20"/>
-          <w:u w:val="none"/>
-        </w:rPr>
-        <w:t>Collaborated directly with the CFO (George Schoorl, Carrier BENELUX) to prepare annual budgeting forecasts.</w:t>
       </w:r>
     </w:p>
     <w:p>

</xml_diff>

<commit_message>
Update CV with latest version
</commit_message>
<xml_diff>
--- a/CV_Konstantinos_Vasilopoulos.docx
+++ b/CV_Konstantinos_Vasilopoulos.docx
@@ -336,61 +336,7 @@
           <w:sz w:val="20"/>
           <w:u w:val="none"/>
         </w:rPr>
-        <w:t>Deployed as Data Consultant to Carrier BENELUX — delivered applied research, statistical analysis, and data visualisation projects on-site.</w:t>
-      </w:r>
-    </w:p>
-    <w:p>
-      <w:pPr>
-        <w:pStyle w:val="ListBullet"/>
-        <w:spacing w:before="0" w:after="20"/>
-        <w:ind w:left="360" w:hanging="259"/>
-      </w:pPr>
-      <w:r>
-        <w:rPr>
-          <w:rFonts w:ascii="Calibri" w:hAnsi="Calibri"/>
-          <w:b w:val="0"/>
-          <w:i w:val="0"/>
-          <w:color w:val="000000"/>
-          <w:sz w:val="20"/>
-          <w:u w:val="none"/>
-        </w:rPr>
-        <w:t>Analysed revenues and expenses to support quarterly forecasting and strategic planning for the BENELUX finance team.</w:t>
-      </w:r>
-    </w:p>
-    <w:p>
-      <w:pPr>
-        <w:pStyle w:val="ListBullet"/>
-        <w:spacing w:before="0" w:after="20"/>
-        <w:ind w:left="360" w:hanging="259"/>
-      </w:pPr>
-      <w:r>
-        <w:rPr>
-          <w:rFonts w:ascii="Calibri" w:hAnsi="Calibri"/>
-          <w:b w:val="0"/>
-          <w:i w:val="0"/>
-          <w:color w:val="000000"/>
-          <w:sz w:val="20"/>
-          <w:u w:val="none"/>
-        </w:rPr>
-        <w:t>Contributed to Oracle HFM to SAP migration by performing data mapping, validation, and reconciliation across global entities.</w:t>
-      </w:r>
-    </w:p>
-    <w:p>
-      <w:pPr>
-        <w:pStyle w:val="ListBullet"/>
-        <w:spacing w:before="0" w:after="20"/>
-        <w:ind w:left="360" w:hanging="259"/>
-      </w:pPr>
-      <w:r>
-        <w:rPr>
-          <w:rFonts w:ascii="Calibri" w:hAnsi="Calibri"/>
-          <w:b w:val="0"/>
-          <w:i w:val="0"/>
-          <w:color w:val="000000"/>
-          <w:sz w:val="20"/>
-          <w:u w:val="none"/>
-        </w:rPr>
-        <w:t>Prepared weekly flash financial reports (balance sheet) for multiple global entities; identified and corrected data errors and missing values.</w:t>
+        <w:t>Delivered applied research, statistical analysis, and data visualisation projects on client site (Carrier B.V.).</w:t>
       </w:r>
     </w:p>
     <w:p>
@@ -409,24 +355,6 @@
           <w:u w:val="none"/>
         </w:rPr>
         <w:t>Built interactive Power BI and Tableau dashboards translating complex datasets into executive-ready business insights.</w:t>
-      </w:r>
-    </w:p>
-    <w:p>
-      <w:pPr>
-        <w:pStyle w:val="ListBullet"/>
-        <w:spacing w:before="0" w:after="20"/>
-        <w:ind w:left="360" w:hanging="259"/>
-      </w:pPr>
-      <w:r>
-        <w:rPr>
-          <w:rFonts w:ascii="Calibri" w:hAnsi="Calibri"/>
-          <w:b w:val="0"/>
-          <w:i w:val="0"/>
-          <w:color w:val="000000"/>
-          <w:sz w:val="20"/>
-          <w:u w:val="none"/>
-        </w:rPr>
-        <w:t>Collaborated directly with the CFO (George Schoorl, Carrier BENELUX) to prepare annual budgeting forecasts.</w:t>
       </w:r>
     </w:p>
     <w:p>
@@ -551,6 +479,148 @@
           <w:u w:val="none"/>
         </w:rPr>
         <w:t>Automated inventory tracking and reporting using Microsoft Excel (conditional formatting, formulas, macros).</w:t>
+      </w:r>
+    </w:p>
+    <w:p>
+      <w:pPr>
+        <w:spacing w:before="120" w:after="20"/>
+        <w:tabs>
+          <w:tab w:val="right" w:pos="9792"/>
+        </w:tabs>
+      </w:pPr>
+      <w:r>
+        <w:rPr>
+          <w:rFonts w:ascii="Calibri" w:hAnsi="Calibri"/>
+          <w:b/>
+          <w:i w:val="0"/>
+          <w:color w:val="000000"/>
+          <w:sz w:val="21"/>
+          <w:u w:val="none"/>
+        </w:rPr>
+        <w:t>FP&amp;A Analyst</w:t>
+      </w:r>
+      <w:r>
+        <w:rPr>
+          <w:rFonts w:ascii="Calibri" w:hAnsi="Calibri"/>
+          <w:b w:val="0"/>
+          <w:i w:val="0"/>
+          <w:color w:val="444444"/>
+          <w:sz w:val="20"/>
+          <w:u w:val="none"/>
+        </w:rPr>
+        <w:t xml:space="preserve">  |  Carrier BENELUX, Utrecht, Netherlands</w:t>
+      </w:r>
+      <w:r>
+        <w:rPr>
+          <w:rFonts w:ascii="Calibri" w:hAnsi="Calibri"/>
+          <w:b w:val="0"/>
+          <w:i w:val="0"/>
+          <w:color w:val="000000"/>
+          <w:sz w:val="20"/>
+          <w:u w:val="none"/>
+        </w:rPr>
+        <w:tab/>
+      </w:r>
+      <w:r>
+        <w:rPr>
+          <w:rFonts w:ascii="Calibri" w:hAnsi="Calibri"/>
+          <w:b w:val="0"/>
+          <w:i/>
+          <w:color w:val="444444"/>
+          <w:sz w:val="19"/>
+          <w:u w:val="none"/>
+        </w:rPr>
+        <w:t>September 2023 – January 2024</w:t>
+      </w:r>
+    </w:p>
+    <w:p>
+      <w:pPr>
+        <w:pStyle w:val="ListBullet"/>
+        <w:spacing w:before="0" w:after="20"/>
+        <w:ind w:left="360" w:hanging="259"/>
+      </w:pPr>
+      <w:r>
+        <w:rPr>
+          <w:rFonts w:ascii="Calibri" w:hAnsi="Calibri"/>
+          <w:b w:val="0"/>
+          <w:i w:val="0"/>
+          <w:color w:val="000000"/>
+          <w:sz w:val="20"/>
+          <w:u w:val="none"/>
+        </w:rPr>
+        <w:t>Analysed revenues and expenses to support quarterly forecasting and strategic planning for the BENELUX finance team.</w:t>
+      </w:r>
+    </w:p>
+    <w:p>
+      <w:pPr>
+        <w:pStyle w:val="ListBullet"/>
+        <w:spacing w:before="0" w:after="20"/>
+        <w:ind w:left="360" w:hanging="259"/>
+      </w:pPr>
+      <w:r>
+        <w:rPr>
+          <w:rFonts w:ascii="Calibri" w:hAnsi="Calibri"/>
+          <w:b w:val="0"/>
+          <w:i w:val="0"/>
+          <w:color w:val="000000"/>
+          <w:sz w:val="20"/>
+          <w:u w:val="none"/>
+        </w:rPr>
+        <w:t>Contributed to Oracle HFM to SAP migration by performing data mapping, validation, and reconciliation across global entities.</w:t>
+      </w:r>
+    </w:p>
+    <w:p>
+      <w:pPr>
+        <w:pStyle w:val="ListBullet"/>
+        <w:spacing w:before="0" w:after="20"/>
+        <w:ind w:left="360" w:hanging="259"/>
+      </w:pPr>
+      <w:r>
+        <w:rPr>
+          <w:rFonts w:ascii="Calibri" w:hAnsi="Calibri"/>
+          <w:b w:val="0"/>
+          <w:i w:val="0"/>
+          <w:color w:val="000000"/>
+          <w:sz w:val="20"/>
+          <w:u w:val="none"/>
+        </w:rPr>
+        <w:t>Prepared weekly flash financial reports (balance sheet) for multiple global entities; identified and corrected data errors and missing values.</w:t>
+      </w:r>
+    </w:p>
+    <w:p>
+      <w:pPr>
+        <w:pStyle w:val="ListBullet"/>
+        <w:spacing w:before="0" w:after="20"/>
+        <w:ind w:left="360" w:hanging="259"/>
+      </w:pPr>
+      <w:r>
+        <w:rPr>
+          <w:rFonts w:ascii="Calibri" w:hAnsi="Calibri"/>
+          <w:b w:val="0"/>
+          <w:i w:val="0"/>
+          <w:color w:val="000000"/>
+          <w:sz w:val="20"/>
+          <w:u w:val="none"/>
+        </w:rPr>
+        <w:t>Streamlined reporting workflows using advanced Excel functions and SAP tools, improving data accessibility for the wider finance team.</w:t>
+      </w:r>
+    </w:p>
+    <w:p>
+      <w:pPr>
+        <w:pStyle w:val="ListBullet"/>
+        <w:spacing w:before="0" w:after="20"/>
+        <w:ind w:left="360" w:hanging="259"/>
+      </w:pPr>
+      <w:r>
+        <w:rPr>
+          <w:rFonts w:ascii="Calibri" w:hAnsi="Calibri"/>
+          <w:b w:val="0"/>
+          <w:i w:val="0"/>
+          <w:color w:val="000000"/>
+          <w:sz w:val="20"/>
+          <w:u w:val="none"/>
+        </w:rPr>
+        <w:t>Collaborated directly with the CFO (George Schoorl, Carrier BENELUX) to prepare annual budgeting forecasts.</w:t>
       </w:r>
     </w:p>
     <w:p>

</xml_diff>

<commit_message>
Sync latest CV to website download
</commit_message>
<xml_diff>
--- a/CV_Konstantinos_Vasilopoulos.docx
+++ b/CV_Konstantinos_Vasilopoulos.docx
@@ -80,7 +80,7 @@
           <w:color w:val="000000"/>
           <w:sz w:val="20"/>
         </w:rPr>
-        <w:t>Data Analyst with 3+ years of experience across e-commerce, finance, and corporate environments. Currently at Shimano, leading data activities on a company-wide SAP S/4HANA migration. I work with Python, SQL, Power BI, and Excel to deliver analysis that drives decisions, not just reports.</w:t>
+        <w:t xml:space="preserve">Data Analyst with 3+ years of experience across e-commerce, finance, and corporate environments. Currently at Shimano, leading data activities on a company-wide SAP S/4HANA migration. I work with Python, SQL, Power BI, and Excel to deliver analysis that drives decisions, not just </w:t>
       </w:r>
       <w:r>
         <w:rPr>
@@ -88,8 +88,7 @@
           <w:color w:val="000000"/>
           <w:sz w:val="20"/>
         </w:rPr>
-        <w:br/>
-        <w:t>MSc in Applied Data Science from Utrecht University, with a thesis on machine learning for healthcare. I keep a close eye on developments in AI and actively apply them where they add real value to the work.</w:t>
+        <w:t>reports. MSc</w:t>
       </w:r>
       <w:r>
         <w:rPr>
@@ -97,7 +96,54 @@
           <w:color w:val="000000"/>
           <w:sz w:val="20"/>
         </w:rPr>
-        <w:br/>
+        <w:t xml:space="preserve"> in Applied Data Science from Utrecht University, with a thesis on machine learning for healthcare. </w:t>
+      </w:r>
+      <w:r>
+        <w:rPr>
+          <w:rFonts w:ascii="Calibri" w:hAnsi="Calibri"/>
+          <w:color w:val="000000"/>
+          <w:sz w:val="20"/>
+        </w:rPr>
+        <w:t>K</w:t>
+      </w:r>
+      <w:r>
+        <w:rPr>
+          <w:rFonts w:ascii="Calibri" w:hAnsi="Calibri"/>
+          <w:color w:val="000000"/>
+          <w:sz w:val="20"/>
+        </w:rPr>
+        <w:t>eep</w:t>
+      </w:r>
+      <w:r>
+        <w:rPr>
+          <w:rFonts w:ascii="Calibri" w:hAnsi="Calibri"/>
+          <w:color w:val="000000"/>
+          <w:sz w:val="20"/>
+        </w:rPr>
+        <w:t>ing</w:t>
+      </w:r>
+      <w:r>
+        <w:rPr>
+          <w:rFonts w:ascii="Calibri" w:hAnsi="Calibri"/>
+          <w:color w:val="000000"/>
+          <w:sz w:val="20"/>
+        </w:rPr>
+        <w:t xml:space="preserve"> a close eye on developments in AI and actively apply them where they add real value to the work.</w:t>
+      </w:r>
+      <w:r>
+        <w:rPr>
+          <w:rFonts w:ascii="Calibri" w:hAnsi="Calibri"/>
+          <w:color w:val="000000"/>
+          <w:sz w:val="20"/>
+        </w:rPr>
+        <w:t xml:space="preserve"> </w:t>
+      </w:r>
+      <w:r>
+        <w:rPr>
+          <w:rFonts w:ascii="Calibri" w:hAnsi="Calibri"/>
+          <w:color w:val="000000"/>
+          <w:sz w:val="20"/>
+        </w:rPr>
         <w:t>I thrive in international settings, enjoy working closely with teams, and believe the best outcomes come from open collaboration and shared knowledge.</w:t>
       </w:r>
       <w:r>
@@ -107,6 +153,15 @@
           <w:sz w:val="20"/>
         </w:rPr>
         <w:br/>
+      </w:r>
+      <w:r>
+        <w:rPr>
+          <w:rFonts w:ascii="Calibri" w:hAnsi="Calibri"/>
+          <w:b/>
+          <w:bCs/>
+          <w:color w:val="000000"/>
+          <w:sz w:val="20"/>
+        </w:rPr>
         <w:t>Get to know me and my work: vasilakis99.github.io/map</w:t>
       </w:r>
     </w:p>

</xml_diff>

<commit_message>
Sync updated CV — Carrier title fix, Shimano Data & Management transfer
</commit_message>
<xml_diff>
--- a/CV_Konstantinos_Vasilopoulos.docx
+++ b/CV_Konstantinos_Vasilopoulos.docx
@@ -200,7 +200,7 @@
           <w:sz w:val="20"/>
           <w:u w:val="none"/>
         </w:rPr>
-        <w:t>Supporting the global B2B and retail websites through the data and management department — analysing, validating, and maintaining product and transactional data at an international scale.</w:t>
+        <w:t>Transferred to the Data and Management team, taking responsibility for data integrity reports and global B2B website maintenance, ensuring product and transactional data accuracy at an international scale.</w:t>
       </w:r>
     </w:p>
     <w:p>
@@ -397,7 +397,7 @@
           <w:sz w:val="21"/>
           <w:u w:val="none"/>
         </w:rPr>
-        <w:t>Embedded Data Analyst</w:t>
+        <w:t>Data Analyst</w:t>
       </w:r>
       <w:r>
         <w:rPr>

</xml_diff>